<commit_message>
Added modified CV file
</commit_message>
<xml_diff>
--- a/Miriam_Ezookwa_Quaisie_CV (1).docx
+++ b/Miriam_Ezookwa_Quaisie_CV (1).docx
@@ -1297,7 +1297,7 @@
           <w:sz w:val="20"/>
           <w:shd w:fill="auto" w:val="clear"/>
         </w:rPr>
-        <w:t xml:space="preserve">(</w:t>
+        <w:t xml:space="preserve">Github link: (</w:t>
       </w:r>
       <w:hyperlink xmlns:r="http://schemas.openxmlformats.org/officeDocument/2006/relationships" r:id="docRId0">
         <w:r>
@@ -1467,6 +1467,17 @@
           <w:color w:val="222222"/>
           <w:spacing w:val="0"/>
           <w:position w:val="0"/>
+          <w:sz w:val="20"/>
+          <w:shd w:fill="auto" w:val="clear"/>
+        </w:rPr>
+        <w:t xml:space="preserve">Github link: </w:t>
+      </w:r>
+      <w:r>
+        <w:rPr>
+          <w:rFonts w:ascii="Arial" w:hAnsi="Arial" w:cs="Arial" w:eastAsia="Arial"/>
+          <w:color w:val="222222"/>
+          <w:spacing w:val="0"/>
+          <w:position w:val="0"/>
           <w:sz w:val="22"/>
           <w:shd w:fill="auto" w:val="clear"/>
         </w:rPr>
@@ -1643,6 +1654,17 @@
           <w:sz w:val="20"/>
           <w:shd w:fill="auto" w:val="clear"/>
         </w:rPr>
+        <w:t xml:space="preserve">Github link: </w:t>
+      </w:r>
+      <w:r>
+        <w:rPr>
+          <w:rFonts w:ascii="Arial" w:hAnsi="Arial" w:cs="Arial" w:eastAsia="Arial"/>
+          <w:color w:val="222222"/>
+          <w:spacing w:val="0"/>
+          <w:position w:val="0"/>
+          <w:sz w:val="20"/>
+          <w:shd w:fill="auto" w:val="clear"/>
+        </w:rPr>
         <w:t xml:space="preserve">(</w:t>
       </w:r>
       <w:hyperlink xmlns:r="http://schemas.openxmlformats.org/officeDocument/2006/relationships" r:id="docRId2">
@@ -1807,6 +1829,17 @@
           <w:shd w:fill="auto" w:val="clear"/>
         </w:rPr>
       </w:pPr>
+      <w:r>
+        <w:rPr>
+          <w:rFonts w:ascii="Arial" w:hAnsi="Arial" w:cs="Arial" w:eastAsia="Arial"/>
+          <w:color w:val="222222"/>
+          <w:spacing w:val="0"/>
+          <w:position w:val="0"/>
+          <w:sz w:val="20"/>
+          <w:shd w:fill="auto" w:val="clear"/>
+        </w:rPr>
+        <w:t xml:space="preserve">Github link: </w:t>
+      </w:r>
       <w:r>
         <w:rPr>
           <w:rFonts w:ascii="Arial" w:hAnsi="Arial" w:cs="Arial" w:eastAsia="Arial"/>

</xml_diff>